<commit_message>
Actualiza el documento del avance 3: LDR y LM35 montados en el panel
Co-Authored-By: Claude Opus 5.5 <noreply@anthropic.com>
</commit_message>
<xml_diff>
--- a/entrega/SIMON_Avance_3_v2.docx
+++ b/entrega/SIMON_Avance_3_v2.docx
@@ -233,7 +233,7 @@
     <w:sdt>
       <w:sdtPr>
         <w:alias w:val="Índice"/>
-        <w:id w:val="-1695070652"/>
+        <w:id w:val="-936671829"/>
       </w:sdtPr>
       <w:sdtEndPr/>
       <w:sdtContent>
@@ -259,7 +259,7 @@
           <w:r>
             <w:fldChar w:fldCharType="separate"/>
           </w:r>
-          <w:hyperlink w:anchor="_Toc244080227" w:history="1">
+          <w:hyperlink w:anchor="_Toc244080344" w:history="1">
             <w:r>
               <w:rPr>
                 <w:rStyle w:val="Hyperlink"/>
@@ -283,7 +283,7 @@
               <w:rPr>
                 <w:noProof/>
               </w:rPr>
-              <w:instrText xml:space="preserve"> PAGEREF _Toc244080227 \h </w:instrText>
+              <w:instrText xml:space="preserve"> PAGEREF _Toc244080344 \h </w:instrText>
             </w:r>
             <w:r>
               <w:rPr>
@@ -323,7 +323,7 @@
               <w14:ligatures w14:val="standardContextual"/>
             </w:rPr>
           </w:pPr>
-          <w:hyperlink w:anchor="_Toc244080228" w:history="1">
+          <w:hyperlink w:anchor="_Toc244080345" w:history="1">
             <w:r>
               <w:rPr>
                 <w:rStyle w:val="Hyperlink"/>
@@ -347,7 +347,7 @@
               <w:rPr>
                 <w:noProof/>
               </w:rPr>
-              <w:instrText xml:space="preserve"> PAGEREF _Toc244080228 \h </w:instrText>
+              <w:instrText xml:space="preserve"> PAGEREF _Toc244080345 \h </w:instrText>
             </w:r>
             <w:r>
               <w:rPr>
@@ -387,7 +387,7 @@
               <w14:ligatures w14:val="standardContextual"/>
             </w:rPr>
           </w:pPr>
-          <w:hyperlink w:anchor="_Toc244080229" w:history="1">
+          <w:hyperlink w:anchor="_Toc244080346" w:history="1">
             <w:r>
               <w:rPr>
                 <w:rStyle w:val="Hyperlink"/>
@@ -411,7 +411,7 @@
               <w:rPr>
                 <w:noProof/>
               </w:rPr>
-              <w:instrText xml:space="preserve"> PAGEREF _Toc244080229 \h </w:instrText>
+              <w:instrText xml:space="preserve"> PAGEREF _Toc244080346 \h </w:instrText>
             </w:r>
             <w:r>
               <w:rPr>
@@ -451,7 +451,7 @@
               <w14:ligatures w14:val="standardContextual"/>
             </w:rPr>
           </w:pPr>
-          <w:hyperlink w:anchor="_Toc244080230" w:history="1">
+          <w:hyperlink w:anchor="_Toc244080347" w:history="1">
             <w:r>
               <w:rPr>
                 <w:rStyle w:val="Hyperlink"/>
@@ -475,7 +475,7 @@
               <w:rPr>
                 <w:noProof/>
               </w:rPr>
-              <w:instrText xml:space="preserve"> PAGEREF _Toc244080230 \h </w:instrText>
+              <w:instrText xml:space="preserve"> PAGEREF _Toc244080347 \h </w:instrText>
             </w:r>
             <w:r>
               <w:rPr>
@@ -515,7 +515,7 @@
               <w14:ligatures w14:val="standardContextual"/>
             </w:rPr>
           </w:pPr>
-          <w:hyperlink w:anchor="_Toc244080231" w:history="1">
+          <w:hyperlink w:anchor="_Toc244080348" w:history="1">
             <w:r>
               <w:rPr>
                 <w:rStyle w:val="Hyperlink"/>
@@ -539,7 +539,7 @@
               <w:rPr>
                 <w:noProof/>
               </w:rPr>
-              <w:instrText xml:space="preserve"> PAGEREF _Toc244080231 \h </w:instrText>
+              <w:instrText xml:space="preserve"> PAGEREF _Toc244080348 \h </w:instrText>
             </w:r>
             <w:r>
               <w:rPr>
@@ -579,7 +579,7 @@
               <w14:ligatures w14:val="standardContextual"/>
             </w:rPr>
           </w:pPr>
-          <w:hyperlink w:anchor="_Toc244080232" w:history="1">
+          <w:hyperlink w:anchor="_Toc244080349" w:history="1">
             <w:r>
               <w:rPr>
                 <w:rStyle w:val="Hyperlink"/>
@@ -603,7 +603,7 @@
               <w:rPr>
                 <w:noProof/>
               </w:rPr>
-              <w:instrText xml:space="preserve"> PAGEREF _Toc244080232 \h </w:instrText>
+              <w:instrText xml:space="preserve"> PAGEREF _Toc244080349 \h </w:instrText>
             </w:r>
             <w:r>
               <w:rPr>
@@ -643,7 +643,7 @@
               <w14:ligatures w14:val="standardContextual"/>
             </w:rPr>
           </w:pPr>
-          <w:hyperlink w:anchor="_Toc244080233" w:history="1">
+          <w:hyperlink w:anchor="_Toc244080350" w:history="1">
             <w:r>
               <w:rPr>
                 <w:rStyle w:val="Hyperlink"/>
@@ -667,7 +667,7 @@
               <w:rPr>
                 <w:noProof/>
               </w:rPr>
-              <w:instrText xml:space="preserve"> PAGEREF _Toc244080233 \h </w:instrText>
+              <w:instrText xml:space="preserve"> PAGEREF _Toc244080350 \h </w:instrText>
             </w:r>
             <w:r>
               <w:rPr>
@@ -707,7 +707,7 @@
               <w14:ligatures w14:val="standardContextual"/>
             </w:rPr>
           </w:pPr>
-          <w:hyperlink w:anchor="_Toc244080234" w:history="1">
+          <w:hyperlink w:anchor="_Toc244080351" w:history="1">
             <w:r>
               <w:rPr>
                 <w:rStyle w:val="Hyperlink"/>
@@ -731,7 +731,7 @@
               <w:rPr>
                 <w:noProof/>
               </w:rPr>
-              <w:instrText xml:space="preserve"> PAGEREF _Toc244080234 \h </w:instrText>
+              <w:instrText xml:space="preserve"> PAGEREF _Toc244080351 \h </w:instrText>
             </w:r>
             <w:r>
               <w:rPr>
@@ -771,7 +771,7 @@
               <w14:ligatures w14:val="standardContextual"/>
             </w:rPr>
           </w:pPr>
-          <w:hyperlink w:anchor="_Toc244080235" w:history="1">
+          <w:hyperlink w:anchor="_Toc244080352" w:history="1">
             <w:r>
               <w:rPr>
                 <w:rStyle w:val="Hyperlink"/>
@@ -795,7 +795,7 @@
               <w:rPr>
                 <w:noProof/>
               </w:rPr>
-              <w:instrText xml:space="preserve"> PAGEREF _Toc244080235 \h </w:instrText>
+              <w:instrText xml:space="preserve"> PAGEREF _Toc244080352 \h </w:instrText>
             </w:r>
             <w:r>
               <w:rPr>
@@ -835,7 +835,7 @@
               <w14:ligatures w14:val="standardContextual"/>
             </w:rPr>
           </w:pPr>
-          <w:hyperlink w:anchor="_Toc244080236" w:history="1">
+          <w:hyperlink w:anchor="_Toc244080353" w:history="1">
             <w:r>
               <w:rPr>
                 <w:rStyle w:val="Hyperlink"/>
@@ -859,7 +859,7 @@
               <w:rPr>
                 <w:noProof/>
               </w:rPr>
-              <w:instrText xml:space="preserve"> PAGEREF _Toc244080236 \h </w:instrText>
+              <w:instrText xml:space="preserve"> PAGEREF _Toc244080353 \h </w:instrText>
             </w:r>
             <w:r>
               <w:rPr>
@@ -899,7 +899,7 @@
               <w14:ligatures w14:val="standardContextual"/>
             </w:rPr>
           </w:pPr>
-          <w:hyperlink w:anchor="_Toc244080237" w:history="1">
+          <w:hyperlink w:anchor="_Toc244080354" w:history="1">
             <w:r>
               <w:rPr>
                 <w:rStyle w:val="Hyperlink"/>
@@ -923,7 +923,7 @@
               <w:rPr>
                 <w:noProof/>
               </w:rPr>
-              <w:instrText xml:space="preserve"> PAGEREF _Toc244080237 \h </w:instrText>
+              <w:instrText xml:space="preserve"> PAGEREF _Toc244080354 \h </w:instrText>
             </w:r>
             <w:r>
               <w:rPr>
@@ -963,7 +963,7 @@
               <w14:ligatures w14:val="standardContextual"/>
             </w:rPr>
           </w:pPr>
-          <w:hyperlink w:anchor="_Toc244080238" w:history="1">
+          <w:hyperlink w:anchor="_Toc244080355" w:history="1">
             <w:r>
               <w:rPr>
                 <w:rStyle w:val="Hyperlink"/>
@@ -987,7 +987,7 @@
               <w:rPr>
                 <w:noProof/>
               </w:rPr>
-              <w:instrText xml:space="preserve"> PAGEREF _Toc244080238 \h </w:instrText>
+              <w:instrText xml:space="preserve"> PAGEREF _Toc244080355 \h </w:instrText>
             </w:r>
             <w:r>
               <w:rPr>
@@ -1027,7 +1027,7 @@
               <w14:ligatures w14:val="standardContextual"/>
             </w:rPr>
           </w:pPr>
-          <w:hyperlink w:anchor="_Toc244080239" w:history="1">
+          <w:hyperlink w:anchor="_Toc244080356" w:history="1">
             <w:r>
               <w:rPr>
                 <w:rStyle w:val="Hyperlink"/>
@@ -1051,7 +1051,7 @@
               <w:rPr>
                 <w:noProof/>
               </w:rPr>
-              <w:instrText xml:space="preserve"> PAGEREF _Toc244080239 \h </w:instrText>
+              <w:instrText xml:space="preserve"> PAGEREF _Toc244080356 \h </w:instrText>
             </w:r>
             <w:r>
               <w:rPr>
@@ -1091,7 +1091,7 @@
               <w14:ligatures w14:val="standardContextual"/>
             </w:rPr>
           </w:pPr>
-          <w:hyperlink w:anchor="_Toc244080240" w:history="1">
+          <w:hyperlink w:anchor="_Toc244080357" w:history="1">
             <w:r>
               <w:rPr>
                 <w:rStyle w:val="Hyperlink"/>
@@ -1115,7 +1115,7 @@
               <w:rPr>
                 <w:noProof/>
               </w:rPr>
-              <w:instrText xml:space="preserve"> PAGEREF _Toc244080240 \h </w:instrText>
+              <w:instrText xml:space="preserve"> PAGEREF _Toc244080357 \h </w:instrText>
             </w:r>
             <w:r>
               <w:rPr>
@@ -1155,7 +1155,7 @@
               <w14:ligatures w14:val="standardContextual"/>
             </w:rPr>
           </w:pPr>
-          <w:hyperlink w:anchor="_Toc244080241" w:history="1">
+          <w:hyperlink w:anchor="_Toc244080358" w:history="1">
             <w:r>
               <w:rPr>
                 <w:rStyle w:val="Hyperlink"/>
@@ -1179,7 +1179,7 @@
               <w:rPr>
                 <w:noProof/>
               </w:rPr>
-              <w:instrText xml:space="preserve"> PAGEREF _Toc244080241 \h </w:instrText>
+              <w:instrText xml:space="preserve"> PAGEREF _Toc244080358 \h </w:instrText>
             </w:r>
             <w:r>
               <w:rPr>
@@ -1219,7 +1219,7 @@
               <w14:ligatures w14:val="standardContextual"/>
             </w:rPr>
           </w:pPr>
-          <w:hyperlink w:anchor="_Toc244080242" w:history="1">
+          <w:hyperlink w:anchor="_Toc244080359" w:history="1">
             <w:r>
               <w:rPr>
                 <w:rStyle w:val="Hyperlink"/>
@@ -1243,7 +1243,7 @@
               <w:rPr>
                 <w:noProof/>
               </w:rPr>
-              <w:instrText xml:space="preserve"> PAGEREF _Toc244080242 \h </w:instrText>
+              <w:instrText xml:space="preserve"> PAGEREF _Toc244080359 \h </w:instrText>
             </w:r>
             <w:r>
               <w:rPr>
@@ -1283,7 +1283,7 @@
               <w14:ligatures w14:val="standardContextual"/>
             </w:rPr>
           </w:pPr>
-          <w:hyperlink w:anchor="_Toc244080243" w:history="1">
+          <w:hyperlink w:anchor="_Toc244080360" w:history="1">
             <w:r>
               <w:rPr>
                 <w:rStyle w:val="Hyperlink"/>
@@ -1307,7 +1307,7 @@
               <w:rPr>
                 <w:noProof/>
               </w:rPr>
-              <w:instrText xml:space="preserve"> PAGEREF _Toc244080243 \h </w:instrText>
+              <w:instrText xml:space="preserve"> PAGEREF _Toc244080360 \h </w:instrText>
             </w:r>
             <w:r>
               <w:rPr>
@@ -1347,7 +1347,7 @@
               <w14:ligatures w14:val="standardContextual"/>
             </w:rPr>
           </w:pPr>
-          <w:hyperlink w:anchor="_Toc244080244" w:history="1">
+          <w:hyperlink w:anchor="_Toc244080361" w:history="1">
             <w:r>
               <w:rPr>
                 <w:rStyle w:val="Hyperlink"/>
@@ -1371,7 +1371,7 @@
               <w:rPr>
                 <w:noProof/>
               </w:rPr>
-              <w:instrText xml:space="preserve"> PAGEREF _Toc244080244 \h </w:instrText>
+              <w:instrText xml:space="preserve"> PAGEREF _Toc244080361 \h </w:instrText>
             </w:r>
             <w:r>
               <w:rPr>
@@ -1411,7 +1411,7 @@
               <w14:ligatures w14:val="standardContextual"/>
             </w:rPr>
           </w:pPr>
-          <w:hyperlink w:anchor="_Toc244080245" w:history="1">
+          <w:hyperlink w:anchor="_Toc244080362" w:history="1">
             <w:r>
               <w:rPr>
                 <w:rStyle w:val="Hyperlink"/>
@@ -1435,7 +1435,7 @@
               <w:rPr>
                 <w:noProof/>
               </w:rPr>
-              <w:instrText xml:space="preserve"> PAGEREF _Toc244080245 \h </w:instrText>
+              <w:instrText xml:space="preserve"> PAGEREF _Toc244080362 \h </w:instrText>
             </w:r>
             <w:r>
               <w:rPr>
@@ -1475,7 +1475,7 @@
               <w14:ligatures w14:val="standardContextual"/>
             </w:rPr>
           </w:pPr>
-          <w:hyperlink w:anchor="_Toc244080246" w:history="1">
+          <w:hyperlink w:anchor="_Toc244080363" w:history="1">
             <w:r>
               <w:rPr>
                 <w:rStyle w:val="Hyperlink"/>
@@ -1499,7 +1499,7 @@
               <w:rPr>
                 <w:noProof/>
               </w:rPr>
-              <w:instrText xml:space="preserve"> PAGEREF _Toc244080246 \h </w:instrText>
+              <w:instrText xml:space="preserve"> PAGEREF _Toc244080363 \h </w:instrText>
             </w:r>
             <w:r>
               <w:rPr>
@@ -1539,7 +1539,7 @@
               <w14:ligatures w14:val="standardContextual"/>
             </w:rPr>
           </w:pPr>
-          <w:hyperlink w:anchor="_Toc244080247" w:history="1">
+          <w:hyperlink w:anchor="_Toc244080364" w:history="1">
             <w:r>
               <w:rPr>
                 <w:rStyle w:val="Hyperlink"/>
@@ -1563,7 +1563,7 @@
               <w:rPr>
                 <w:noProof/>
               </w:rPr>
-              <w:instrText xml:space="preserve"> PAGEREF _Toc244080247 \h </w:instrText>
+              <w:instrText xml:space="preserve"> PAGEREF _Toc244080364 \h </w:instrText>
             </w:r>
             <w:r>
               <w:rPr>
@@ -1603,7 +1603,7 @@
               <w14:ligatures w14:val="standardContextual"/>
             </w:rPr>
           </w:pPr>
-          <w:hyperlink w:anchor="_Toc244080248" w:history="1">
+          <w:hyperlink w:anchor="_Toc244080365" w:history="1">
             <w:r>
               <w:rPr>
                 <w:rStyle w:val="Hyperlink"/>
@@ -1627,7 +1627,7 @@
               <w:rPr>
                 <w:noProof/>
               </w:rPr>
-              <w:instrText xml:space="preserve"> PAGEREF _Toc244080248 \h </w:instrText>
+              <w:instrText xml:space="preserve"> PAGEREF _Toc244080365 \h </w:instrText>
             </w:r>
             <w:r>
               <w:rPr>
@@ -1644,7 +1644,7 @@
               <w:rPr>
                 <w:noProof/>
               </w:rPr>
-              <w:t>8</w:t>
+              <w:t>9</w:t>
             </w:r>
             <w:r>
               <w:rPr>
@@ -1667,7 +1667,7 @@
               <w14:ligatures w14:val="standardContextual"/>
             </w:rPr>
           </w:pPr>
-          <w:hyperlink w:anchor="_Toc244080249" w:history="1">
+          <w:hyperlink w:anchor="_Toc244080366" w:history="1">
             <w:r>
               <w:rPr>
                 <w:rStyle w:val="Hyperlink"/>
@@ -1691,7 +1691,7 @@
               <w:rPr>
                 <w:noProof/>
               </w:rPr>
-              <w:instrText xml:space="preserve"> PAGEREF _Toc244080249 \h </w:instrText>
+              <w:instrText xml:space="preserve"> PAGEREF _Toc244080366 \h </w:instrText>
             </w:r>
             <w:r>
               <w:rPr>
@@ -1731,7 +1731,7 @@
               <w14:ligatures w14:val="standardContextual"/>
             </w:rPr>
           </w:pPr>
-          <w:hyperlink w:anchor="_Toc244080250" w:history="1">
+          <w:hyperlink w:anchor="_Toc244080367" w:history="1">
             <w:r>
               <w:rPr>
                 <w:rStyle w:val="Hyperlink"/>
@@ -1755,7 +1755,7 @@
               <w:rPr>
                 <w:noProof/>
               </w:rPr>
-              <w:instrText xml:space="preserve"> PAGEREF _Toc244080250 \h </w:instrText>
+              <w:instrText xml:space="preserve"> PAGEREF _Toc244080367 \h </w:instrText>
             </w:r>
             <w:r>
               <w:rPr>
@@ -1795,7 +1795,7 @@
               <w14:ligatures w14:val="standardContextual"/>
             </w:rPr>
           </w:pPr>
-          <w:hyperlink w:anchor="_Toc244080251" w:history="1">
+          <w:hyperlink w:anchor="_Toc244080368" w:history="1">
             <w:r>
               <w:rPr>
                 <w:rStyle w:val="Hyperlink"/>
@@ -1819,7 +1819,7 @@
               <w:rPr>
                 <w:noProof/>
               </w:rPr>
-              <w:instrText xml:space="preserve"> PAGEREF _Toc244080251 \h </w:instrText>
+              <w:instrText xml:space="preserve"> PAGEREF _Toc244080368 \h </w:instrText>
             </w:r>
             <w:r>
               <w:rPr>
@@ -1859,7 +1859,7 @@
               <w14:ligatures w14:val="standardContextual"/>
             </w:rPr>
           </w:pPr>
-          <w:hyperlink w:anchor="_Toc244080252" w:history="1">
+          <w:hyperlink w:anchor="_Toc244080369" w:history="1">
             <w:r>
               <w:rPr>
                 <w:rStyle w:val="Hyperlink"/>
@@ -1883,7 +1883,7 @@
               <w:rPr>
                 <w:noProof/>
               </w:rPr>
-              <w:instrText xml:space="preserve"> PAGEREF _Toc244080252 \h </w:instrText>
+              <w:instrText xml:space="preserve"> PAGEREF _Toc244080369 \h </w:instrText>
             </w:r>
             <w:r>
               <w:rPr>
@@ -1923,7 +1923,7 @@
               <w14:ligatures w14:val="standardContextual"/>
             </w:rPr>
           </w:pPr>
-          <w:hyperlink w:anchor="_Toc244080253" w:history="1">
+          <w:hyperlink w:anchor="_Toc244080370" w:history="1">
             <w:r>
               <w:rPr>
                 <w:rStyle w:val="Hyperlink"/>
@@ -1947,7 +1947,7 @@
               <w:rPr>
                 <w:noProof/>
               </w:rPr>
-              <w:instrText xml:space="preserve"> PAGEREF _Toc244080253 \h </w:instrText>
+              <w:instrText xml:space="preserve"> PAGEREF _Toc244080370 \h </w:instrText>
             </w:r>
             <w:r>
               <w:rPr>
@@ -1987,7 +1987,7 @@
               <w14:ligatures w14:val="standardContextual"/>
             </w:rPr>
           </w:pPr>
-          <w:hyperlink w:anchor="_Toc244080254" w:history="1">
+          <w:hyperlink w:anchor="_Toc244080371" w:history="1">
             <w:r>
               <w:rPr>
                 <w:rStyle w:val="Hyperlink"/>
@@ -2011,7 +2011,7 @@
               <w:rPr>
                 <w:noProof/>
               </w:rPr>
-              <w:instrText xml:space="preserve"> PAGEREF _Toc244080254 \h </w:instrText>
+              <w:instrText xml:space="preserve"> PAGEREF _Toc244080371 \h </w:instrText>
             </w:r>
             <w:r>
               <w:rPr>
@@ -2051,7 +2051,7 @@
               <w14:ligatures w14:val="standardContextual"/>
             </w:rPr>
           </w:pPr>
-          <w:hyperlink w:anchor="_Toc244080255" w:history="1">
+          <w:hyperlink w:anchor="_Toc244080372" w:history="1">
             <w:r>
               <w:rPr>
                 <w:rStyle w:val="Hyperlink"/>
@@ -2075,7 +2075,7 @@
               <w:rPr>
                 <w:noProof/>
               </w:rPr>
-              <w:instrText xml:space="preserve"> PAGEREF _Toc244080255 \h </w:instrText>
+              <w:instrText xml:space="preserve"> PAGEREF _Toc244080372 \h </w:instrText>
             </w:r>
             <w:r>
               <w:rPr>
@@ -2115,7 +2115,7 @@
               <w14:ligatures w14:val="standardContextual"/>
             </w:rPr>
           </w:pPr>
-          <w:hyperlink w:anchor="_Toc244080256" w:history="1">
+          <w:hyperlink w:anchor="_Toc244080373" w:history="1">
             <w:r>
               <w:rPr>
                 <w:rStyle w:val="Hyperlink"/>
@@ -2139,7 +2139,7 @@
               <w:rPr>
                 <w:noProof/>
               </w:rPr>
-              <w:instrText xml:space="preserve"> PAGEREF _Toc244080256 \h </w:instrText>
+              <w:instrText xml:space="preserve"> PAGEREF _Toc244080373 \h </w:instrText>
             </w:r>
             <w:r>
               <w:rPr>
@@ -2179,7 +2179,7 @@
               <w14:ligatures w14:val="standardContextual"/>
             </w:rPr>
           </w:pPr>
-          <w:hyperlink w:anchor="_Toc244080257" w:history="1">
+          <w:hyperlink w:anchor="_Toc244080374" w:history="1">
             <w:r>
               <w:rPr>
                 <w:rStyle w:val="Hyperlink"/>
@@ -2203,7 +2203,7 @@
               <w:rPr>
                 <w:noProof/>
               </w:rPr>
-              <w:instrText xml:space="preserve"> PAGEREF _Toc244080257 \h </w:instrText>
+              <w:instrText xml:space="preserve"> PAGEREF _Toc244080374 \h </w:instrText>
             </w:r>
             <w:r>
               <w:rPr>
@@ -2243,7 +2243,7 @@
               <w14:ligatures w14:val="standardContextual"/>
             </w:rPr>
           </w:pPr>
-          <w:hyperlink w:anchor="_Toc244080258" w:history="1">
+          <w:hyperlink w:anchor="_Toc244080375" w:history="1">
             <w:r>
               <w:rPr>
                 <w:rStyle w:val="Hyperlink"/>
@@ -2275,7 +2275,7 @@
               <w:rPr>
                 <w:noProof/>
               </w:rPr>
-              <w:instrText xml:space="preserve"> PAGEREF _Toc244080258 \h </w:instrText>
+              <w:instrText xml:space="preserve"> PAGEREF _Toc244080375 \h </w:instrText>
             </w:r>
             <w:r>
               <w:rPr>
@@ -2315,7 +2315,7 @@
               <w14:ligatures w14:val="standardContextual"/>
             </w:rPr>
           </w:pPr>
-          <w:hyperlink w:anchor="_Toc244080259" w:history="1">
+          <w:hyperlink w:anchor="_Toc244080376" w:history="1">
             <w:r>
               <w:rPr>
                 <w:rStyle w:val="Hyperlink"/>
@@ -2339,7 +2339,7 @@
               <w:rPr>
                 <w:noProof/>
               </w:rPr>
-              <w:instrText xml:space="preserve"> PAGEREF _Toc244080259 \h </w:instrText>
+              <w:instrText xml:space="preserve"> PAGEREF _Toc244080376 \h </w:instrText>
             </w:r>
             <w:r>
               <w:rPr>
@@ -2379,7 +2379,7 @@
               <w14:ligatures w14:val="standardContextual"/>
             </w:rPr>
           </w:pPr>
-          <w:hyperlink w:anchor="_Toc244080260" w:history="1">
+          <w:hyperlink w:anchor="_Toc244080377" w:history="1">
             <w:r>
               <w:rPr>
                 <w:rStyle w:val="Hyperlink"/>
@@ -2403,7 +2403,7 @@
               <w:rPr>
                 <w:noProof/>
               </w:rPr>
-              <w:instrText xml:space="preserve"> PAGEREF _Toc244080260 \h </w:instrText>
+              <w:instrText xml:space="preserve"> PAGEREF _Toc244080377 \h </w:instrText>
             </w:r>
             <w:r>
               <w:rPr>
@@ -2443,7 +2443,7 @@
               <w14:ligatures w14:val="standardContextual"/>
             </w:rPr>
           </w:pPr>
-          <w:hyperlink w:anchor="_Toc244080261" w:history="1">
+          <w:hyperlink w:anchor="_Toc244080378" w:history="1">
             <w:r>
               <w:rPr>
                 <w:rStyle w:val="Hyperlink"/>
@@ -2467,7 +2467,7 @@
               <w:rPr>
                 <w:noProof/>
               </w:rPr>
-              <w:instrText xml:space="preserve"> PAGEREF _Toc244080261 \h </w:instrText>
+              <w:instrText xml:space="preserve"> PAGEREF _Toc244080378 \h </w:instrText>
             </w:r>
             <w:r>
               <w:rPr>
@@ -2484,7 +2484,7 @@
               <w:rPr>
                 <w:noProof/>
               </w:rPr>
-              <w:t>12</w:t>
+              <w:t>13</w:t>
             </w:r>
             <w:r>
               <w:rPr>
@@ -2507,7 +2507,7 @@
               <w14:ligatures w14:val="standardContextual"/>
             </w:rPr>
           </w:pPr>
-          <w:hyperlink w:anchor="_Toc244080262" w:history="1">
+          <w:hyperlink w:anchor="_Toc244080379" w:history="1">
             <w:r>
               <w:rPr>
                 <w:rStyle w:val="Hyperlink"/>
@@ -2531,7 +2531,7 @@
               <w:rPr>
                 <w:noProof/>
               </w:rPr>
-              <w:instrText xml:space="preserve"> PAGEREF _Toc244080262 \h </w:instrText>
+              <w:instrText xml:space="preserve"> PAGEREF _Toc244080379 \h </w:instrText>
             </w:r>
             <w:r>
               <w:rPr>
@@ -2571,7 +2571,7 @@
               <w14:ligatures w14:val="standardContextual"/>
             </w:rPr>
           </w:pPr>
-          <w:hyperlink w:anchor="_Toc244080263" w:history="1">
+          <w:hyperlink w:anchor="_Toc244080380" w:history="1">
             <w:r>
               <w:rPr>
                 <w:rStyle w:val="Hyperlink"/>
@@ -2595,7 +2595,7 @@
               <w:rPr>
                 <w:noProof/>
               </w:rPr>
-              <w:instrText xml:space="preserve"> PAGEREF _Toc244080263 \h </w:instrText>
+              <w:instrText xml:space="preserve"> PAGEREF _Toc244080380 \h </w:instrText>
             </w:r>
             <w:r>
               <w:rPr>
@@ -2635,7 +2635,7 @@
               <w14:ligatures w14:val="standardContextual"/>
             </w:rPr>
           </w:pPr>
-          <w:hyperlink w:anchor="_Toc244080264" w:history="1">
+          <w:hyperlink w:anchor="_Toc244080381" w:history="1">
             <w:r>
               <w:rPr>
                 <w:rStyle w:val="Hyperlink"/>
@@ -2659,7 +2659,7 @@
               <w:rPr>
                 <w:noProof/>
               </w:rPr>
-              <w:instrText xml:space="preserve"> PAGEREF _Toc244080264 \h </w:instrText>
+              <w:instrText xml:space="preserve"> PAGEREF _Toc244080381 \h </w:instrText>
             </w:r>
             <w:r>
               <w:rPr>
@@ -2699,7 +2699,7 @@
               <w14:ligatures w14:val="standardContextual"/>
             </w:rPr>
           </w:pPr>
-          <w:hyperlink w:anchor="_Toc244080265" w:history="1">
+          <w:hyperlink w:anchor="_Toc244080382" w:history="1">
             <w:r>
               <w:rPr>
                 <w:rStyle w:val="Hyperlink"/>
@@ -2723,7 +2723,7 @@
               <w:rPr>
                 <w:noProof/>
               </w:rPr>
-              <w:instrText xml:space="preserve"> PAGEREF _Toc244080265 \h </w:instrText>
+              <w:instrText xml:space="preserve"> PAGEREF _Toc244080382 \h </w:instrText>
             </w:r>
             <w:r>
               <w:rPr>
@@ -2763,7 +2763,7 @@
               <w14:ligatures w14:val="standardContextual"/>
             </w:rPr>
           </w:pPr>
-          <w:hyperlink w:anchor="_Toc244080266" w:history="1">
+          <w:hyperlink w:anchor="_Toc244080383" w:history="1">
             <w:r>
               <w:rPr>
                 <w:rStyle w:val="Hyperlink"/>
@@ -2787,7 +2787,7 @@
               <w:rPr>
                 <w:noProof/>
               </w:rPr>
-              <w:instrText xml:space="preserve"> PAGEREF _Toc244080266 \h </w:instrText>
+              <w:instrText xml:space="preserve"> PAGEREF _Toc244080383 \h </w:instrText>
             </w:r>
             <w:r>
               <w:rPr>
@@ -2827,7 +2827,7 @@
               <w14:ligatures w14:val="standardContextual"/>
             </w:rPr>
           </w:pPr>
-          <w:hyperlink w:anchor="_Toc244080267" w:history="1">
+          <w:hyperlink w:anchor="_Toc244080384" w:history="1">
             <w:r>
               <w:rPr>
                 <w:rStyle w:val="Hyperlink"/>
@@ -2851,7 +2851,7 @@
               <w:rPr>
                 <w:noProof/>
               </w:rPr>
-              <w:instrText xml:space="preserve"> PAGEREF _Toc244080267 \h </w:instrText>
+              <w:instrText xml:space="preserve"> PAGEREF _Toc244080384 \h </w:instrText>
             </w:r>
             <w:r>
               <w:rPr>
@@ -2891,7 +2891,7 @@
               <w14:ligatures w14:val="standardContextual"/>
             </w:rPr>
           </w:pPr>
-          <w:hyperlink w:anchor="_Toc244080268" w:history="1">
+          <w:hyperlink w:anchor="_Toc244080385" w:history="1">
             <w:r>
               <w:rPr>
                 <w:rStyle w:val="Hyperlink"/>
@@ -2915,7 +2915,7 @@
               <w:rPr>
                 <w:noProof/>
               </w:rPr>
-              <w:instrText xml:space="preserve"> PAGEREF _Toc244080268 \h </w:instrText>
+              <w:instrText xml:space="preserve"> PAGEREF _Toc244080385 \h </w:instrText>
             </w:r>
             <w:r>
               <w:rPr>
@@ -2969,7 +2969,7 @@
         <w:pStyle w:val="Heading1"/>
         <w:keepNext/>
       </w:pPr>
-      <w:bookmarkStart w:id="0" w:name="_Toc244080227"/>
+      <w:bookmarkStart w:id="0" w:name="_Toc244080344"/>
       <w:r>
         <w:t>Resumen</w:t>
       </w:r>
@@ -3028,7 +3028,7 @@
         <w:pStyle w:val="Heading1"/>
         <w:keepNext/>
       </w:pPr>
-      <w:bookmarkStart w:id="1" w:name="_Toc244080228"/>
+      <w:bookmarkStart w:id="1" w:name="_Toc244080345"/>
       <w:r>
         <w:t>1. Introducción</w:t>
       </w:r>
@@ -3066,7 +3066,7 @@
         <w:pStyle w:val="Heading1"/>
         <w:keepNext/>
       </w:pPr>
-      <w:bookmarkStart w:id="2" w:name="_Toc244080229"/>
+      <w:bookmarkStart w:id="2" w:name="_Toc244080346"/>
       <w:r>
         <w:t>2. Objetivos</w:t>
       </w:r>
@@ -3190,7 +3190,7 @@
         <w:pStyle w:val="Heading1"/>
         <w:keepNext/>
       </w:pPr>
-      <w:bookmarkStart w:id="3" w:name="_Toc244080230"/>
+      <w:bookmarkStart w:id="3" w:name="_Toc244080347"/>
       <w:r>
         <w:t>3. Marco teórico</w:t>
       </w:r>
@@ -3201,7 +3201,7 @@
         <w:pStyle w:val="Heading2"/>
         <w:keepNext/>
       </w:pPr>
-      <w:bookmarkStart w:id="4" w:name="_Toc244080231"/>
+      <w:bookmarkStart w:id="4" w:name="_Toc244080348"/>
       <w:r>
         <w:t>3.1 La celda fotovoltaica y su curva I-V</w:t>
       </w:r>
@@ -3380,7 +3380,7 @@
         <w:pStyle w:val="Heading2"/>
         <w:keepNext/>
       </w:pPr>
-      <w:bookmarkStart w:id="5" w:name="_Toc244080232"/>
+      <w:bookmarkStart w:id="5" w:name="_Toc244080349"/>
       <w:r>
         <w:t>3.2 Efecto de la irradiancia y la temperatura</w:t>
       </w:r>
@@ -3436,7 +3436,7 @@
         <w:pStyle w:val="Heading2"/>
         <w:keepNext/>
       </w:pPr>
-      <w:bookmarkStart w:id="6" w:name="_Toc244080233"/>
+      <w:bookmarkStart w:id="6" w:name="_Toc244080350"/>
       <w:r>
         <w:t>3.3 Eficiencia y potencia teórica</w:t>
       </w:r>
@@ -3501,7 +3501,7 @@
         <w:pStyle w:val="Heading2"/>
         <w:keepNext/>
       </w:pPr>
-      <w:bookmarkStart w:id="7" w:name="_Toc244080234"/>
+      <w:bookmarkStart w:id="7" w:name="_Toc244080351"/>
       <w:r>
         <w:t>3.4 Medición de la irradiancia</w:t>
       </w:r>
@@ -3530,7 +3530,7 @@
         <w:pStyle w:val="Heading1"/>
         <w:keepNext/>
       </w:pPr>
-      <w:bookmarkStart w:id="8" w:name="_Toc244080235"/>
+      <w:bookmarkStart w:id="8" w:name="_Toc244080352"/>
       <w:r>
         <w:t>4. Diseño y fabricación de la PCB</w:t>
       </w:r>
@@ -3550,7 +3550,7 @@
         <w:pStyle w:val="Heading2"/>
         <w:keepNext/>
       </w:pPr>
-      <w:bookmarkStart w:id="9" w:name="_Toc244080236"/>
+      <w:bookmarkStart w:id="9" w:name="_Toc244080353"/>
       <w:r>
         <w:t>4.1 Metodología de diseño</w:t>
       </w:r>
@@ -3576,7 +3576,7 @@
           <w:noProof/>
         </w:rPr>
         <w:drawing>
-          <wp:inline distT="0" distB="0" distL="0" distR="0" wp14:anchorId="2AA84817" wp14:editId="14E26E6E">
+          <wp:inline distT="0" distB="0" distL="0" distR="0" wp14:anchorId="27FE5836" wp14:editId="638AE389">
             <wp:extent cx="4953000" cy="2809875"/>
             <wp:effectExtent l="0" t="0" r="0" b="0"/>
             <wp:docPr id="1" name="Picture 1"/>
@@ -3641,10 +3641,10 @@
           <w:noProof/>
         </w:rPr>
         <w:drawing>
-          <wp:inline distT="0" distB="0" distL="0" distR="0" wp14:anchorId="4DB31DCB" wp14:editId="6B8AD88C">
+          <wp:inline distT="0" distB="0" distL="0" distR="0" wp14:anchorId="6247E964" wp14:editId="7BD18D5F">
             <wp:extent cx="5715000" cy="3429000"/>
             <wp:effectExtent l="0" t="0" r="0" b="0"/>
-            <wp:docPr id="609657231" name="Picture 609657231"/>
+            <wp:docPr id="832293345" name="Picture 832293345"/>
             <wp:cNvGraphicFramePr>
               <a:graphicFrameLocks xmlns:a="http://schemas.openxmlformats.org/drawingml/2006/main" noChangeAspect="1"/>
             </wp:cNvGraphicFramePr>
@@ -3725,7 +3725,7 @@
           <w:left w:w="10" w:type="dxa"/>
           <w:right w:w="10" w:type="dxa"/>
         </w:tblCellMar>
-        <w:tblLook w:val="04A0" w:firstRow="1" w:lastRow="0" w:firstColumn="1" w:lastColumn="0" w:noHBand="0" w:noVBand="1"/>
+        <w:tblLook w:val="0000" w:firstRow="0" w:lastRow="0" w:firstColumn="0" w:lastColumn="0" w:noHBand="0" w:noVBand="0"/>
       </w:tblPr>
       <w:tblGrid>
         <w:gridCol w:w="2396"/>
@@ -4466,7 +4466,7 @@
         <w:pStyle w:val="Heading2"/>
         <w:keepNext/>
       </w:pPr>
-      <w:bookmarkStart w:id="10" w:name="_Toc244080237"/>
+      <w:bookmarkStart w:id="10" w:name="_Toc244080354"/>
       <w:r>
         <w:t>4.2 Redes del circuito</w:t>
       </w:r>
@@ -4502,7 +4502,7 @@
           <w:left w:w="10" w:type="dxa"/>
           <w:right w:w="10" w:type="dxa"/>
         </w:tblCellMar>
-        <w:tblLook w:val="04A0" w:firstRow="1" w:lastRow="0" w:firstColumn="1" w:lastColumn="0" w:noHBand="0" w:noVBand="1"/>
+        <w:tblLook w:val="0000" w:firstRow="0" w:lastRow="0" w:firstColumn="0" w:lastColumn="0" w:noHBand="0" w:noVBand="0"/>
       </w:tblPr>
       <w:tblGrid>
         <w:gridCol w:w="1221"/>
@@ -5103,7 +5103,7 @@
         <w:pStyle w:val="Heading2"/>
         <w:keepNext/>
       </w:pPr>
-      <w:bookmarkStart w:id="11" w:name="_Toc244080238"/>
+      <w:bookmarkStart w:id="11" w:name="_Toc244080355"/>
       <w:r>
         <w:t>4.3 Dimensionamiento de la carga</w:t>
       </w:r>
@@ -5168,7 +5168,7 @@
         <w:pStyle w:val="Heading2"/>
         <w:keepNext/>
       </w:pPr>
-      <w:bookmarkStart w:id="12" w:name="_Toc244080239"/>
+      <w:bookmarkStart w:id="12" w:name="_Toc244080356"/>
       <w:r>
         <w:t>4.4 Fabricación</w:t>
       </w:r>
@@ -5194,10 +5194,10 @@
           <w:noProof/>
         </w:rPr>
         <w:drawing>
-          <wp:inline distT="0" distB="0" distL="0" distR="0" wp14:anchorId="48A270F7" wp14:editId="1AD4822F">
+          <wp:inline distT="0" distB="0" distL="0" distR="0" wp14:anchorId="312972DE" wp14:editId="1E288425">
             <wp:extent cx="4381500" cy="2857500"/>
             <wp:effectExtent l="0" t="0" r="0" b="0"/>
-            <wp:docPr id="1941840297" name="Picture 1941840297"/>
+            <wp:docPr id="1104261410" name="Picture 1104261410"/>
             <wp:cNvGraphicFramePr>
               <a:graphicFrameLocks xmlns:a="http://schemas.openxmlformats.org/drawingml/2006/main" noChangeAspect="1"/>
             </wp:cNvGraphicFramePr>
@@ -5253,7 +5253,7 @@
         <w:pStyle w:val="Heading1"/>
         <w:keepNext/>
       </w:pPr>
-      <w:bookmarkStart w:id="13" w:name="_Toc244080240"/>
+      <w:bookmarkStart w:id="13" w:name="_Toc244080357"/>
       <w:r>
         <w:t>5. Selección y justificación de sensores</w:t>
       </w:r>
@@ -5298,7 +5298,7 @@
           <w:left w:w="10" w:type="dxa"/>
           <w:right w:w="10" w:type="dxa"/>
         </w:tblCellMar>
-        <w:tblLook w:val="04A0" w:firstRow="1" w:lastRow="0" w:firstColumn="1" w:lastColumn="0" w:noHBand="0" w:noVBand="1"/>
+        <w:tblLook w:val="0000" w:firstRow="0" w:lastRow="0" w:firstColumn="0" w:lastColumn="0" w:noHBand="0" w:noVBand="0"/>
       </w:tblPr>
       <w:tblGrid>
         <w:gridCol w:w="1222"/>
@@ -7714,7 +7714,7 @@
         <w:pStyle w:val="Heading2"/>
         <w:keepNext/>
       </w:pPr>
-      <w:bookmarkStart w:id="14" w:name="_Toc244080241"/>
+      <w:bookmarkStart w:id="14" w:name="_Toc244080358"/>
       <w:r>
         <w:t>5.1 INA219</w:t>
       </w:r>
@@ -7743,7 +7743,7 @@
         <w:pStyle w:val="Heading2"/>
         <w:keepNext/>
       </w:pPr>
-      <w:bookmarkStart w:id="15" w:name="_Toc244080242"/>
+      <w:bookmarkStart w:id="15" w:name="_Toc244080359"/>
       <w:r>
         <w:t>5.2 LM35</w:t>
       </w:r>
@@ -7755,7 +7755,7 @@
         <w:jc w:val="both"/>
       </w:pPr>
       <w:r>
-        <w:t>Se leyó con atenuación de 6 dB (rango ≈150–1750 mV, suficiente hasta ≈175 °C) y con analogReadMilliVolts(), que aplica la calibración de fábrica del ADC. Su ubicación actual dentro de la caja mide la temperatura del gabinete y no la de la celda; esta limitación se trata en la sección 12.</w:t>
+        <w:t>Se leyó con atenuación de 6 dB (rango ≈150–1750 mV, suficiente hasta ≈175 °C) y con analogReadMilliVolts(), que aplica la calibración de fábrica del ADC. El sensor se sacó de la PCB y se montó en el marco del panel, conectado con cables, para que mida la temperatura junto a la celda y no la del gabinete. Con cables largos se recomienda una resistencia de ≈2 kΩ en serie con la salida para evitar oscilaciones.</w:t>
       </w:r>
     </w:p>
     <w:p>
@@ -7763,7 +7763,7 @@
         <w:pStyle w:val="Heading2"/>
         <w:keepNext/>
       </w:pPr>
-      <w:bookmarkStart w:id="16" w:name="_Toc244080243"/>
+      <w:bookmarkStart w:id="16" w:name="_Toc244080360"/>
       <w:r>
         <w:t>5.3 LDR</w:t>
       </w:r>
@@ -7847,7 +7847,7 @@
         <w:t>LDR</w:t>
       </w:r>
       <w:r>
-        <w:t xml:space="preserve"> se acerca a 3 V, donde el ADC del ESP32 deja de ser lineal. Por eso la LDR no se usa sola: se calibra contra la corriente del panel (sección 9).</w:t>
+        <w:t xml:space="preserve"> se acerca a 3 V, donde el ADC del ESP32 deja de ser lineal. Por eso la LDR no se usa sola: se calibra contra la corriente del panel (sección 9). La LDR también se montó en el marco del panel, en el mismo plano que la celda, de modo que recibe la misma luz y sigue la inclinación del panel.</w:t>
       </w:r>
     </w:p>
     <w:p>
@@ -7855,7 +7855,7 @@
         <w:pStyle w:val="Heading1"/>
         <w:keepNext/>
       </w:pPr>
-      <w:bookmarkStart w:id="17" w:name="_Toc244080244"/>
+      <w:bookmarkStart w:id="17" w:name="_Toc244080361"/>
       <w:r>
         <w:t>6. Firmware del ESP32</w:t>
       </w:r>
@@ -7875,7 +7875,7 @@
         <w:pStyle w:val="Heading2"/>
         <w:keepNext/>
       </w:pPr>
-      <w:bookmarkStart w:id="18" w:name="_Toc244080245"/>
+      <w:bookmarkStart w:id="18" w:name="_Toc244080362"/>
       <w:r>
         <w:t>6.1 Arranque y modos de operación</w:t>
       </w:r>
@@ -7895,7 +7895,7 @@
         <w:pStyle w:val="Heading2"/>
         <w:keepNext/>
       </w:pPr>
-      <w:bookmarkStart w:id="19" w:name="_Toc244080246"/>
+      <w:bookmarkStart w:id="19" w:name="_Toc244080363"/>
       <w:r>
         <w:t>6.2 Ciclo de adquisición (1 Hz)</w:t>
       </w:r>
@@ -7990,7 +7990,7 @@
         <w:pStyle w:val="Heading2"/>
         <w:keepNext/>
       </w:pPr>
-      <w:bookmarkStart w:id="20" w:name="_Toc244080247"/>
+      <w:bookmarkStart w:id="20" w:name="_Toc244080364"/>
       <w:r>
         <w:t>6.3 Transmisión a la nube</w:t>
       </w:r>
@@ -8010,7 +8010,7 @@
         <w:pStyle w:val="Heading2"/>
         <w:keepNext/>
       </w:pPr>
-      <w:bookmarkStart w:id="21" w:name="_Toc244080248"/>
+      <w:bookmarkStart w:id="21" w:name="_Toc244080365"/>
       <w:r>
         <w:t>6.4 Diagnóstico de sensores</w:t>
       </w:r>
@@ -8030,7 +8030,7 @@
         <w:pStyle w:val="Heading1"/>
         <w:keepNext/>
       </w:pPr>
-      <w:bookmarkStart w:id="22" w:name="_Toc244080249"/>
+      <w:bookmarkStart w:id="22" w:name="_Toc244080366"/>
       <w:r>
         <w:t>7. Arquitectura en la nube: API y base de datos</w:t>
       </w:r>
@@ -8056,10 +8056,10 @@
           <w:noProof/>
         </w:rPr>
         <w:drawing>
-          <wp:inline distT="0" distB="0" distL="0" distR="0" wp14:anchorId="6592FF5E" wp14:editId="535B9F20">
+          <wp:inline distT="0" distB="0" distL="0" distR="0" wp14:anchorId="13623C96" wp14:editId="3ABB025C">
             <wp:extent cx="5715000" cy="2752725"/>
             <wp:effectExtent l="0" t="0" r="0" b="0"/>
-            <wp:docPr id="936861625" name="Picture 936861625"/>
+            <wp:docPr id="1927218225" name="Picture 1927218225"/>
             <wp:cNvGraphicFramePr>
               <a:graphicFrameLocks xmlns:a="http://schemas.openxmlformats.org/drawingml/2006/main" noChangeAspect="1"/>
             </wp:cNvGraphicFramePr>
@@ -8124,7 +8124,7 @@
         <w:pStyle w:val="Heading2"/>
         <w:keepNext/>
       </w:pPr>
-      <w:bookmarkStart w:id="23" w:name="_Toc244080250"/>
+      <w:bookmarkStart w:id="23" w:name="_Toc244080367"/>
       <w:r>
         <w:t>7.1 API (Cloudflare Worker)</w:t>
       </w:r>
@@ -8169,7 +8169,7 @@
           <w:left w:w="10" w:type="dxa"/>
           <w:right w:w="10" w:type="dxa"/>
         </w:tblCellMar>
-        <w:tblLook w:val="04A0" w:firstRow="1" w:lastRow="0" w:firstColumn="1" w:lastColumn="0" w:noHBand="0" w:noVBand="1"/>
+        <w:tblLook w:val="0000" w:firstRow="0" w:lastRow="0" w:firstColumn="0" w:lastColumn="0" w:noHBand="0" w:noVBand="0"/>
       </w:tblPr>
       <w:tblGrid>
         <w:gridCol w:w="2191"/>
@@ -8741,7 +8741,7 @@
         <w:pStyle w:val="Heading2"/>
         <w:keepNext/>
       </w:pPr>
-      <w:bookmarkStart w:id="24" w:name="_Toc244080251"/>
+      <w:bookmarkStart w:id="24" w:name="_Toc244080368"/>
       <w:r>
         <w:t>7.2 Base de datos (Cloudflare D1)</w:t>
       </w:r>
@@ -8786,7 +8786,7 @@
           <w:left w:w="10" w:type="dxa"/>
           <w:right w:w="10" w:type="dxa"/>
         </w:tblCellMar>
-        <w:tblLook w:val="04A0" w:firstRow="1" w:lastRow="0" w:firstColumn="1" w:lastColumn="0" w:noHBand="0" w:noVBand="1"/>
+        <w:tblLook w:val="0000" w:firstRow="0" w:lastRow="0" w:firstColumn="0" w:lastColumn="0" w:noHBand="0" w:noVBand="0"/>
       </w:tblPr>
       <w:tblGrid>
         <w:gridCol w:w="867"/>
@@ -9091,7 +9091,7 @@
         <w:pStyle w:val="Heading2"/>
         <w:keepNext/>
       </w:pPr>
-      <w:bookmarkStart w:id="25" w:name="_Toc244080252"/>
+      <w:bookmarkStart w:id="25" w:name="_Toc244080369"/>
       <w:r>
         <w:t>7.3 Despliegue</w:t>
       </w:r>
@@ -9111,7 +9111,7 @@
         <w:pStyle w:val="Heading1"/>
         <w:keepNext/>
       </w:pPr>
-      <w:bookmarkStart w:id="26" w:name="_Toc244080253"/>
+      <w:bookmarkStart w:id="26" w:name="_Toc244080370"/>
       <w:r>
         <w:t>8. Dashboard web</w:t>
       </w:r>
@@ -9156,7 +9156,7 @@
           <w:left w:w="10" w:type="dxa"/>
           <w:right w:w="10" w:type="dxa"/>
         </w:tblCellMar>
-        <w:tblLook w:val="04A0" w:firstRow="1" w:lastRow="0" w:firstColumn="1" w:lastColumn="0" w:noHBand="0" w:noVBand="1"/>
+        <w:tblLook w:val="0000" w:firstRow="0" w:lastRow="0" w:firstColumn="0" w:lastColumn="0" w:noHBand="0" w:noVBand="0"/>
       </w:tblPr>
       <w:tblGrid>
         <w:gridCol w:w="1667"/>
@@ -9568,7 +9568,7 @@
         <w:pStyle w:val="Heading2"/>
         <w:keepNext/>
       </w:pPr>
-      <w:bookmarkStart w:id="27" w:name="_Toc244080254"/>
+      <w:bookmarkStart w:id="27" w:name="_Toc244080371"/>
       <w:r>
         <w:t>8.1 Cálculos en el navegador</w:t>
       </w:r>
@@ -9597,7 +9597,7 @@
         <w:pStyle w:val="Heading2"/>
         <w:keepNext/>
       </w:pPr>
-      <w:bookmarkStart w:id="28" w:name="_Toc244080255"/>
+      <w:bookmarkStart w:id="28" w:name="_Toc244080372"/>
       <w:r>
         <w:t>8.2 Modelo predictivo de demostración</w:t>
       </w:r>
@@ -9617,7 +9617,7 @@
         <w:pStyle w:val="Heading1"/>
         <w:keepNext/>
       </w:pPr>
-      <w:bookmarkStart w:id="29" w:name="_Toc244080256"/>
+      <w:bookmarkStart w:id="29" w:name="_Toc244080373"/>
       <w:r>
         <w:t>9. Irradiancia por dos vías e índice de suciedad</w:t>
       </w:r>
@@ -9637,7 +9637,7 @@
         <w:pStyle w:val="Heading2"/>
         <w:keepNext/>
       </w:pPr>
-      <w:bookmarkStart w:id="30" w:name="_Toc244080257"/>
+      <w:bookmarkStart w:id="30" w:name="_Toc244080374"/>
       <w:r>
         <w:t>9.1 El panel como celda de referencia</w:t>
       </w:r>
@@ -9792,7 +9792,7 @@
         <w:pStyle w:val="Heading2"/>
         <w:keepNext/>
       </w:pPr>
-      <w:bookmarkStart w:id="31" w:name="_Toc244080258"/>
+      <w:bookmarkStart w:id="31" w:name="_Toc244080375"/>
       <w:r>
         <w:t>9.2 Por qué no basta con G</w:t>
       </w:r>
@@ -9845,7 +9845,7 @@
         <w:pStyle w:val="Heading2"/>
         <w:keepNext/>
       </w:pPr>
-      <w:bookmarkStart w:id="32" w:name="_Toc244080259"/>
+      <w:bookmarkStart w:id="32" w:name="_Toc244080376"/>
       <w:r>
         <w:t>9.3 Índice de suciedad</w:t>
       </w:r>
@@ -9857,7 +9857,7 @@
         <w:jc w:val="both"/>
       </w:pPr>
       <w:r>
-        <w:t>Las dos estimaciones ven fenómenos distintos: la LDR, limpia dentro de su ventana, mide la luz que llega; el panel mide la luz que logra atravesar el polvo. Su cociente es el índice de suciedad:</w:t>
+        <w:t>Las dos estimaciones ven fenómenos distintos: la LDR, montada en el marco junto a la celda, mide la luz que llega al plano del panel; el panel mide la luz que logra atravesar el polvo de su superficie. Su cociente es el índice de suciedad:</w:t>
       </w:r>
     </w:p>
     <w:p>
@@ -9898,7 +9898,7 @@
         <w:pStyle w:val="Heading2"/>
         <w:keepNext/>
       </w:pPr>
-      <w:bookmarkStart w:id="33" w:name="_Toc244080260"/>
+      <w:bookmarkStart w:id="33" w:name="_Toc244080377"/>
       <w:r>
         <w:t>9.4 Calibración de la LDR</w:t>
       </w:r>
@@ -10011,7 +10011,7 @@
         <w:pStyle w:val="Heading1"/>
         <w:keepNext/>
       </w:pPr>
-      <w:bookmarkStart w:id="34" w:name="_Toc244080261"/>
+      <w:bookmarkStart w:id="34" w:name="_Toc244080378"/>
       <w:r>
         <w:t>10. Montaje mecánico</w:t>
       </w:r>
@@ -10056,7 +10056,7 @@
           <w:left w:w="10" w:type="dxa"/>
           <w:right w:w="10" w:type="dxa"/>
         </w:tblCellMar>
-        <w:tblLook w:val="04A0" w:firstRow="1" w:lastRow="0" w:firstColumn="1" w:lastColumn="0" w:noHBand="0" w:noVBand="1"/>
+        <w:tblLook w:val="0000" w:firstRow="0" w:lastRow="0" w:firstColumn="0" w:lastColumn="0" w:noHBand="0" w:noVBand="0"/>
       </w:tblPr>
       <w:tblGrid>
         <w:gridCol w:w="1816"/>
@@ -10442,7 +10442,7 @@
         <w:jc w:val="both"/>
       </w:pPr>
       <w:r>
-        <w:t>Con la base giratoria y la bisagra, el panel se puede orientar en azimut y en inclinación, y el transportador permite repetir un ángulo entre pruebas: es una variable controlada para comparar condiciones en la caracterización I-V.</w:t>
+        <w:t>Con la base giratoria y la bisagra, el panel se puede orientar en azimut y en inclinación, y el transportador permite repetir un ángulo entre pruebas: es una variable controlada para comparar condiciones en la caracterización I-V. La LDR y el LM35 van montados en el marco del panel, de modo que miden la luz y la temperatura en el plano de la celda y se inclinan junto con ella.</w:t>
       </w:r>
     </w:p>
     <w:p>
@@ -10456,10 +10456,10 @@
           <w:noProof/>
         </w:rPr>
         <w:drawing>
-          <wp:inline distT="0" distB="0" distL="0" distR="0" wp14:anchorId="7CF470A1" wp14:editId="4891C0CE">
+          <wp:inline distT="0" distB="0" distL="0" distR="0" wp14:anchorId="33566248" wp14:editId="14053C5A">
             <wp:extent cx="5334000" cy="2257425"/>
             <wp:effectExtent l="0" t="0" r="0" b="0"/>
-            <wp:docPr id="1463550524" name="Picture 1463550524"/>
+            <wp:docPr id="810021457" name="Picture 810021457"/>
             <wp:cNvGraphicFramePr>
               <a:graphicFrameLocks xmlns:a="http://schemas.openxmlformats.org/drawingml/2006/main" noChangeAspect="1"/>
             </wp:cNvGraphicFramePr>
@@ -10521,10 +10521,10 @@
           <w:noProof/>
         </w:rPr>
         <w:drawing>
-          <wp:inline distT="0" distB="0" distL="0" distR="0" wp14:anchorId="1A9E8378" wp14:editId="4E2643E5">
+          <wp:inline distT="0" distB="0" distL="0" distR="0" wp14:anchorId="27E8F428" wp14:editId="2EEB637F">
             <wp:extent cx="5334000" cy="1990725"/>
             <wp:effectExtent l="0" t="0" r="0" b="0"/>
-            <wp:docPr id="687058584" name="Picture 687058584"/>
+            <wp:docPr id="740917440" name="Picture 740917440"/>
             <wp:cNvGraphicFramePr>
               <a:graphicFrameLocks xmlns:a="http://schemas.openxmlformats.org/drawingml/2006/main" noChangeAspect="1"/>
             </wp:cNvGraphicFramePr>
@@ -10586,10 +10586,10 @@
           <w:noProof/>
         </w:rPr>
         <w:drawing>
-          <wp:inline distT="0" distB="0" distL="0" distR="0" wp14:anchorId="2D0795F6" wp14:editId="1710DC2E">
+          <wp:inline distT="0" distB="0" distL="0" distR="0" wp14:anchorId="1754C51F" wp14:editId="2A1B02C4">
             <wp:extent cx="5334000" cy="1962150"/>
             <wp:effectExtent l="0" t="0" r="0" b="0"/>
-            <wp:docPr id="1722551303" name="Picture 1722551303"/>
+            <wp:docPr id="2064376981" name="Picture 2064376981"/>
             <wp:cNvGraphicFramePr>
               <a:graphicFrameLocks xmlns:a="http://schemas.openxmlformats.org/drawingml/2006/main" noChangeAspect="1"/>
             </wp:cNvGraphicFramePr>
@@ -10660,10 +10660,10 @@
           <w:noProof/>
         </w:rPr>
         <w:drawing>
-          <wp:inline distT="0" distB="0" distL="0" distR="0" wp14:anchorId="7CDB9411" wp14:editId="0ECC5BB2">
+          <wp:inline distT="0" distB="0" distL="0" distR="0" wp14:anchorId="6945DE23" wp14:editId="3867C2C0">
             <wp:extent cx="5715000" cy="2114550"/>
             <wp:effectExtent l="0" t="0" r="0" b="0"/>
-            <wp:docPr id="664746929" name="Picture 664746929"/>
+            <wp:docPr id="1920043009" name="Picture 1920043009"/>
             <wp:cNvGraphicFramePr>
               <a:graphicFrameLocks xmlns:a="http://schemas.openxmlformats.org/drawingml/2006/main" noChangeAspect="1"/>
             </wp:cNvGraphicFramePr>
@@ -10725,10 +10725,10 @@
           <w:noProof/>
         </w:rPr>
         <w:drawing>
-          <wp:inline distT="0" distB="0" distL="0" distR="0" wp14:anchorId="50E67788" wp14:editId="34847B44">
+          <wp:inline distT="0" distB="0" distL="0" distR="0" wp14:anchorId="7FA71803" wp14:editId="48512A3E">
             <wp:extent cx="5334000" cy="2505075"/>
             <wp:effectExtent l="0" t="0" r="0" b="0"/>
-            <wp:docPr id="847694293" name="Picture 847694293"/>
+            <wp:docPr id="194487390" name="Picture 194487390"/>
             <wp:cNvGraphicFramePr>
               <a:graphicFrameLocks xmlns:a="http://schemas.openxmlformats.org/drawingml/2006/main" noChangeAspect="1"/>
             </wp:cNvGraphicFramePr>
@@ -10784,7 +10784,7 @@
         <w:pStyle w:val="Heading1"/>
         <w:keepNext/>
       </w:pPr>
-      <w:bookmarkStart w:id="35" w:name="_Toc244080262"/>
+      <w:bookmarkStart w:id="35" w:name="_Toc244080379"/>
       <w:r>
         <w:t>11. Caracterización y validación</w:t>
       </w:r>
@@ -10804,7 +10804,7 @@
         <w:pStyle w:val="Heading2"/>
         <w:keepNext/>
       </w:pPr>
-      <w:bookmarkStart w:id="36" w:name="_Toc244080263"/>
+      <w:bookmarkStart w:id="36" w:name="_Toc244080380"/>
       <w:r>
         <w:t>11.1 Curva I-V</w:t>
       </w:r>
@@ -10991,7 +10991,7 @@
           <w:left w:w="10" w:type="dxa"/>
           <w:right w:w="10" w:type="dxa"/>
         </w:tblCellMar>
-        <w:tblLook w:val="04A0" w:firstRow="1" w:lastRow="0" w:firstColumn="1" w:lastColumn="0" w:noHBand="0" w:noVBand="1"/>
+        <w:tblLook w:val="0000" w:firstRow="0" w:lastRow="0" w:firstColumn="0" w:lastColumn="0" w:noHBand="0" w:noVBand="0"/>
       </w:tblPr>
       <w:tblGrid>
         <w:gridCol w:w="2273"/>
@@ -11746,7 +11746,7 @@
         <w:pStyle w:val="Heading2"/>
         <w:keepNext/>
       </w:pPr>
-      <w:bookmarkStart w:id="37" w:name="_Toc244080264"/>
+      <w:bookmarkStart w:id="37" w:name="_Toc244080381"/>
       <w:r>
         <w:t>11.2 Validación contra instrumentos de referencia</w:t>
       </w:r>
@@ -11791,7 +11791,7 @@
           <w:left w:w="10" w:type="dxa"/>
           <w:right w:w="10" w:type="dxa"/>
         </w:tblCellMar>
-        <w:tblLook w:val="04A0" w:firstRow="1" w:lastRow="0" w:firstColumn="1" w:lastColumn="0" w:noHBand="0" w:noVBand="1"/>
+        <w:tblLook w:val="0000" w:firstRow="0" w:lastRow="0" w:firstColumn="0" w:lastColumn="0" w:noHBand="0" w:noVBand="0"/>
       </w:tblPr>
       <w:tblGrid>
         <w:gridCol w:w="1222"/>
@@ -12374,7 +12374,7 @@
           <w:left w:w="10" w:type="dxa"/>
           <w:right w:w="10" w:type="dxa"/>
         </w:tblCellMar>
-        <w:tblLook w:val="04A0" w:firstRow="1" w:lastRow="0" w:firstColumn="1" w:lastColumn="0" w:noHBand="0" w:noVBand="1"/>
+        <w:tblLook w:val="0000" w:firstRow="0" w:lastRow="0" w:firstColumn="0" w:lastColumn="0" w:noHBand="0" w:noVBand="0"/>
       </w:tblPr>
       <w:tblGrid>
         <w:gridCol w:w="1223"/>
@@ -13099,7 +13099,7 @@
         <w:pStyle w:val="Heading1"/>
         <w:keepNext/>
       </w:pPr>
-      <w:bookmarkStart w:id="38" w:name="_Toc244080265"/>
+      <w:bookmarkStart w:id="38" w:name="_Toc244080382"/>
       <w:r>
         <w:t>12. Limitaciones y trabajo futuro</w:t>
       </w:r>
@@ -13135,7 +13135,7 @@
           <w:left w:w="10" w:type="dxa"/>
           <w:right w:w="10" w:type="dxa"/>
         </w:tblCellMar>
-        <w:tblLook w:val="04A0" w:firstRow="1" w:lastRow="0" w:firstColumn="1" w:lastColumn="0" w:noHBand="0" w:noVBand="1"/>
+        <w:tblLook w:val="0000" w:firstRow="0" w:lastRow="0" w:firstColumn="0" w:lastColumn="0" w:noHBand="0" w:noVBand="0"/>
       </w:tblPr>
       <w:tblGrid>
         <w:gridCol w:w="446"/>
@@ -13299,7 +13299,7 @@
                 <w:sz w:val="20"/>
                 <w:szCs w:val="20"/>
               </w:rPr>
-              <w:t>El LM35 está soldado en la PCB y mide la temperatura del gabinete, no la de la celda, que a pleno sol es ≈25 °C mayor.</w:t>
+              <w:t>El LM35 está en el marco del panel, pero sin contacto térmico directo con la celda, que a pleno sol puede estar varios grados por encima del aire que la rodea.</w:t>
             </w:r>
           </w:p>
         </w:tc>
@@ -13325,7 +13325,7 @@
                 <w:sz w:val="20"/>
                 <w:szCs w:val="20"/>
               </w:rPr>
-              <w:t>Sacarlo con tres cables y adherirlo a la parte trasera del panel con cinta de aluminio o pasta térmica, con ≈2 kΩ en serie en la salida para evitar oscilaciones; o sustituirlo por una sonda DS18B20.</w:t>
+              <w:t>Adherirlo a la parte trasera del panel con pasta térmica o cinta de aluminio y validarlo contra un termómetro infrarrojo; o sustituirlo por una sonda DS18B20.</w:t>
             </w:r>
           </w:p>
         </w:tc>
@@ -13730,7 +13730,7 @@
                 <w:sz w:val="20"/>
                 <w:szCs w:val="20"/>
               </w:rPr>
-              <w:t>La ventana de la LDR también se ensucia, lo que reduce G</w:t>
+              <w:t>La LDR, montada junto al panel, también acumula polvo, lo que reduce G</w:t>
             </w:r>
             <w:r>
               <w:rPr>
@@ -14346,7 +14346,7 @@
         <w:pStyle w:val="Heading2"/>
         <w:keepNext/>
       </w:pPr>
-      <w:bookmarkStart w:id="39" w:name="_Toc244080266"/>
+      <w:bookmarkStart w:id="39" w:name="_Toc244080383"/>
       <w:r>
         <w:t>12.1 Trabajo pendiente para el siguiente avance</w:t>
       </w:r>
@@ -14471,7 +14471,7 @@
         <w:pStyle w:val="Heading1"/>
         <w:keepNext/>
       </w:pPr>
-      <w:bookmarkStart w:id="40" w:name="_Toc244080267"/>
+      <w:bookmarkStart w:id="40" w:name="_Toc244080384"/>
       <w:r>
         <w:t>13. Conclusiones</w:t>
       </w:r>
@@ -14558,7 +14558,7 @@
         <w:jc w:val="both"/>
       </w:pPr>
       <w:r>
-        <w:t>Quedan pendientes la caracterización I-V en dos condiciones, la validación cuantitativa contra instrumentos de referencia, la reubicación del LM35 sobre el panel y la recolección de datos de campo para entrenar el modelo predictivo.</w:t>
+        <w:t>Quedan pendientes la caracterización I-V en dos condiciones, la validación cuantitativa contra instrumentos de referencia, el contacto térmico del LM35 con la celda y la recolección de datos de campo para entrenar el modelo predictivo.</w:t>
       </w:r>
     </w:p>
     <w:p>
@@ -14566,7 +14566,7 @@
         <w:pStyle w:val="Heading1"/>
         <w:keepNext/>
       </w:pPr>
-      <w:bookmarkStart w:id="41" w:name="_Toc244080268"/>
+      <w:bookmarkStart w:id="41" w:name="_Toc244080385"/>
       <w:r>
         <w:t>Referencias</w:t>
       </w:r>
@@ -14735,10 +14735,10 @@
 <file path=word/numbering.xml><?xml version="1.0" encoding="utf-8"?>
 <w:numbering xmlns:wpc="http://schemas.microsoft.com/office/word/2010/wordprocessingCanvas" xmlns:cx="http://schemas.microsoft.com/office/drawing/2014/chartex" xmlns:cx1="http://schemas.microsoft.com/office/drawing/2015/9/8/chartex" xmlns:cx2="http://schemas.microsoft.com/office/drawing/2015/10/21/chartex" xmlns:cx3="http://schemas.microsoft.com/office/drawing/2016/5/9/chartex" xmlns:cx4="http://schemas.microsoft.com/office/drawing/2016/5/10/chartex" xmlns:cx5="http://schemas.microsoft.com/office/drawing/2016/5/11/chartex" xmlns:cx6="http://schemas.microsoft.com/office/drawing/2016/5/12/chartex" xmlns:cx7="http://schemas.microsoft.com/office/drawing/2016/5/13/chartex" xmlns:cx8="http://schemas.microsoft.com/office/drawing/2016/5/14/chartex" xmlns:mc="http://schemas.openxmlformats.org/markup-compatibility/2006" xmlns:aink="http://schemas.microsoft.com/office/drawing/2016/ink" xmlns:am3d="http://schemas.microsoft.com/office/drawing/2017/model3d" xmlns:o="urn:schemas-microsoft-com:office:office" xmlns:oel="http://schemas.microsoft.com/office/2019/extlst" xmlns:r="http://schemas.openxmlformats.org/officeDocument/2006/relationships" xmlns:m="http://schemas.openxmlformats.org/officeDocument/2006/math" xmlns:v="urn:schemas-microsoft-com:vml" xmlns:wp14="http://schemas.microsoft.com/office/word/2010/wordprocessingDrawing" xmlns:wp="http://schemas.openxmlformats.org/drawingml/2006/wordprocessingDrawing" xmlns:w10="urn:schemas-microsoft-com:office:word" xmlns:w="http://schemas.openxmlformats.org/wordprocessingml/2006/main" xmlns:w14="http://schemas.microsoft.com/office/word/2010/wordml" xmlns:w15="http://schemas.microsoft.com/office/word/2012/wordml" xmlns:w16cex="http://schemas.microsoft.com/office/word/2018/wordml/cex" xmlns:w16cid="http://schemas.microsoft.com/office/word/2016/wordml/cid" xmlns:w16="http://schemas.microsoft.com/office/word/2018/wordml" xmlns:w16du="http://schemas.microsoft.com/office/word/2023/wordml/word16du" xmlns:w16sdtdh="http://schemas.microsoft.com/office/word/2020/wordml/sdtdatahash" xmlns:w16sdtfl="http://schemas.microsoft.com/office/word/2024/wordml/sdtformatlock" xmlns:w16se="http://schemas.microsoft.com/office/word/2015/wordml/symex" xmlns:wpg="http://schemas.microsoft.com/office/word/2010/wordprocessingGroup" xmlns:wpi="http://schemas.microsoft.com/office/word/2010/wordprocessingInk" xmlns:wne="http://schemas.microsoft.com/office/word/2006/wordml" xmlns:wps="http://schemas.microsoft.com/office/word/2010/wordprocessingShape" mc:Ignorable="w14 w15 w16se w16cid w16 w16cex w16sdtdh w16sdtfl w16du wp14">
   <w:abstractNum w:abstractNumId="0" w15:restartNumberingAfterBreak="0">
-    <w:nsid w:val="01AD71DF"/>
+    <w:nsid w:val="11C30DC0"/>
     <w:multiLevelType w:val="hybridMultilevel"/>
-    <w:tmpl w:val="7352A48A"/>
-    <w:lvl w:ilvl="0" w:tplc="EE165498">
+    <w:tmpl w:val="5BD21246"/>
+    <w:lvl w:ilvl="0" w:tplc="7952E468">
       <w:start w:val="1"/>
       <w:numFmt w:val="decimal"/>
       <w:lvlText w:val="%1."/>
@@ -14750,109 +14750,106 @@
         <w:rFonts w:ascii="Times New Roman" w:eastAsia="Times New Roman" w:hAnsi="Times New Roman" w:cs="Times New Roman"/>
       </w:rPr>
     </w:lvl>
-    <w:lvl w:ilvl="1" w:tplc="E2903BF2">
+    <w:lvl w:ilvl="1" w:tplc="048A7456">
       <w:numFmt w:val="decimal"/>
       <w:lvlText w:val=""/>
       <w:lvlJc w:val="left"/>
     </w:lvl>
-    <w:lvl w:ilvl="2" w:tplc="438A937E">
+    <w:lvl w:ilvl="2" w:tplc="9DCAFA78">
       <w:numFmt w:val="decimal"/>
       <w:lvlText w:val=""/>
       <w:lvlJc w:val="left"/>
     </w:lvl>
-    <w:lvl w:ilvl="3" w:tplc="CD18B3EC">
+    <w:lvl w:ilvl="3" w:tplc="8AD0F434">
       <w:numFmt w:val="decimal"/>
       <w:lvlText w:val=""/>
       <w:lvlJc w:val="left"/>
     </w:lvl>
-    <w:lvl w:ilvl="4" w:tplc="D59689F4">
+    <w:lvl w:ilvl="4" w:tplc="F120FD02">
       <w:numFmt w:val="decimal"/>
       <w:lvlText w:val=""/>
       <w:lvlJc w:val="left"/>
     </w:lvl>
-    <w:lvl w:ilvl="5" w:tplc="F8B6E8DA">
+    <w:lvl w:ilvl="5" w:tplc="D9C602FA">
       <w:numFmt w:val="decimal"/>
       <w:lvlText w:val=""/>
       <w:lvlJc w:val="left"/>
     </w:lvl>
-    <w:lvl w:ilvl="6" w:tplc="780614F4">
+    <w:lvl w:ilvl="6" w:tplc="8B2CB844">
       <w:numFmt w:val="decimal"/>
       <w:lvlText w:val=""/>
       <w:lvlJc w:val="left"/>
     </w:lvl>
-    <w:lvl w:ilvl="7" w:tplc="37842A1E">
+    <w:lvl w:ilvl="7" w:tplc="91EC8C40">
       <w:numFmt w:val="decimal"/>
       <w:lvlText w:val=""/>
       <w:lvlJc w:val="left"/>
     </w:lvl>
-    <w:lvl w:ilvl="8" w:tplc="4042A40C">
+    <w:lvl w:ilvl="8" w:tplc="03A8B764">
       <w:numFmt w:val="decimal"/>
       <w:lvlText w:val=""/>
       <w:lvlJc w:val="left"/>
     </w:lvl>
   </w:abstractNum>
   <w:abstractNum w:abstractNumId="1" w15:restartNumberingAfterBreak="0">
-    <w:nsid w:val="027B6352"/>
+    <w:nsid w:val="302420E4"/>
     <w:multiLevelType w:val="hybridMultilevel"/>
-    <w:tmpl w:val="3DFEC152"/>
-    <w:lvl w:ilvl="0" w:tplc="13A2755A">
+    <w:tmpl w:val="10A4C6D6"/>
+    <w:lvl w:ilvl="0" w:tplc="BBCE61A2">
       <w:start w:val="1"/>
-      <w:numFmt w:val="decimal"/>
-      <w:lvlText w:val="%1."/>
+      <w:numFmt w:val="bullet"/>
+      <w:lvlText w:val="•"/>
       <w:lvlJc w:val="left"/>
       <w:pPr>
         <w:ind w:left="540" w:hanging="360"/>
       </w:pPr>
-      <w:rPr>
-        <w:rFonts w:ascii="Times New Roman" w:eastAsia="Times New Roman" w:hAnsi="Times New Roman" w:cs="Times New Roman"/>
-      </w:rPr>
     </w:lvl>
-    <w:lvl w:ilvl="1" w:tplc="6902D7B6">
+    <w:lvl w:ilvl="1" w:tplc="FC2E3782">
       <w:numFmt w:val="decimal"/>
       <w:lvlText w:val=""/>
       <w:lvlJc w:val="left"/>
     </w:lvl>
-    <w:lvl w:ilvl="2" w:tplc="03203084">
+    <w:lvl w:ilvl="2" w:tplc="ED30E998">
       <w:numFmt w:val="decimal"/>
       <w:lvlText w:val=""/>
       <w:lvlJc w:val="left"/>
     </w:lvl>
-    <w:lvl w:ilvl="3" w:tplc="BB2C4136">
+    <w:lvl w:ilvl="3" w:tplc="18304FB6">
       <w:numFmt w:val="decimal"/>
       <w:lvlText w:val=""/>
       <w:lvlJc w:val="left"/>
     </w:lvl>
-    <w:lvl w:ilvl="4" w:tplc="11E83B6A">
+    <w:lvl w:ilvl="4" w:tplc="50D44DD4">
       <w:numFmt w:val="decimal"/>
       <w:lvlText w:val=""/>
       <w:lvlJc w:val="left"/>
     </w:lvl>
-    <w:lvl w:ilvl="5" w:tplc="D014146E">
+    <w:lvl w:ilvl="5" w:tplc="413C126A">
       <w:numFmt w:val="decimal"/>
       <w:lvlText w:val=""/>
       <w:lvlJc w:val="left"/>
     </w:lvl>
-    <w:lvl w:ilvl="6" w:tplc="26249F8A">
+    <w:lvl w:ilvl="6" w:tplc="D966AEF4">
       <w:numFmt w:val="decimal"/>
       <w:lvlText w:val=""/>
       <w:lvlJc w:val="left"/>
     </w:lvl>
-    <w:lvl w:ilvl="7" w:tplc="19868B3C">
+    <w:lvl w:ilvl="7" w:tplc="395CD97E">
       <w:numFmt w:val="decimal"/>
       <w:lvlText w:val=""/>
       <w:lvlJc w:val="left"/>
     </w:lvl>
-    <w:lvl w:ilvl="8" w:tplc="E6AA9ADC">
+    <w:lvl w:ilvl="8" w:tplc="3C2A63F0">
       <w:numFmt w:val="decimal"/>
       <w:lvlText w:val=""/>
       <w:lvlJc w:val="left"/>
     </w:lvl>
   </w:abstractNum>
   <w:abstractNum w:abstractNumId="2" w15:restartNumberingAfterBreak="0">
-    <w:nsid w:val="3DA24075"/>
+    <w:nsid w:val="389E4A0E"/>
     <w:multiLevelType w:val="hybridMultilevel"/>
-    <w:tmpl w:val="2E2E028E"/>
-    <w:lvl w:ilvl="0" w:tplc="76065DE2">
+    <w:tmpl w:val="86D2A916"/>
+    <w:lvl w:ilvl="0" w:tplc="45346A32">
       <w:start w:val="1"/>
       <w:numFmt w:val="decimal"/>
       <w:lvlText w:val="%1."/>
@@ -14864,52 +14861,52 @@
         <w:rFonts w:ascii="Times New Roman" w:eastAsia="Times New Roman" w:hAnsi="Times New Roman" w:cs="Times New Roman"/>
       </w:rPr>
     </w:lvl>
-    <w:lvl w:ilvl="1" w:tplc="1916D802">
+    <w:lvl w:ilvl="1" w:tplc="69369784">
       <w:numFmt w:val="decimal"/>
       <w:lvlText w:val=""/>
       <w:lvlJc w:val="left"/>
     </w:lvl>
-    <w:lvl w:ilvl="2" w:tplc="52EEE116">
+    <w:lvl w:ilvl="2" w:tplc="0E588D6A">
       <w:numFmt w:val="decimal"/>
       <w:lvlText w:val=""/>
       <w:lvlJc w:val="left"/>
     </w:lvl>
-    <w:lvl w:ilvl="3" w:tplc="CC0A55C0">
+    <w:lvl w:ilvl="3" w:tplc="A4BC45AA">
       <w:numFmt w:val="decimal"/>
       <w:lvlText w:val=""/>
       <w:lvlJc w:val="left"/>
     </w:lvl>
-    <w:lvl w:ilvl="4" w:tplc="09E6045A">
+    <w:lvl w:ilvl="4" w:tplc="032E7892">
       <w:numFmt w:val="decimal"/>
       <w:lvlText w:val=""/>
       <w:lvlJc w:val="left"/>
     </w:lvl>
-    <w:lvl w:ilvl="5" w:tplc="3A08CB9C">
+    <w:lvl w:ilvl="5" w:tplc="1C38DEF4">
       <w:numFmt w:val="decimal"/>
       <w:lvlText w:val=""/>
       <w:lvlJc w:val="left"/>
     </w:lvl>
-    <w:lvl w:ilvl="6" w:tplc="B784E53C">
+    <w:lvl w:ilvl="6" w:tplc="B09CC15E">
       <w:numFmt w:val="decimal"/>
       <w:lvlText w:val=""/>
       <w:lvlJc w:val="left"/>
     </w:lvl>
-    <w:lvl w:ilvl="7" w:tplc="D81C2FFA">
+    <w:lvl w:ilvl="7" w:tplc="A87051B4">
       <w:numFmt w:val="decimal"/>
       <w:lvlText w:val=""/>
       <w:lvlJc w:val="left"/>
     </w:lvl>
-    <w:lvl w:ilvl="8" w:tplc="EB6E8672">
+    <w:lvl w:ilvl="8" w:tplc="BF349E84">
       <w:numFmt w:val="decimal"/>
       <w:lvlText w:val=""/>
       <w:lvlJc w:val="left"/>
     </w:lvl>
   </w:abstractNum>
   <w:abstractNum w:abstractNumId="3" w15:restartNumberingAfterBreak="0">
-    <w:nsid w:val="45A34F90"/>
+    <w:nsid w:val="42F9166A"/>
     <w:multiLevelType w:val="hybridMultilevel"/>
-    <w:tmpl w:val="D3ACFCE4"/>
-    <w:lvl w:ilvl="0" w:tplc="70640CDC">
+    <w:tmpl w:val="7A7E9220"/>
+    <w:lvl w:ilvl="0" w:tplc="422CFCA4">
       <w:start w:val="1"/>
       <w:numFmt w:val="bullet"/>
       <w:lvlText w:val="●"/>
@@ -14918,7 +14915,7 @@
         <w:ind w:left="720" w:hanging="360"/>
       </w:pPr>
     </w:lvl>
-    <w:lvl w:ilvl="1" w:tplc="C08071D6">
+    <w:lvl w:ilvl="1" w:tplc="D990FF58">
       <w:start w:val="1"/>
       <w:numFmt w:val="bullet"/>
       <w:lvlText w:val="○"/>
@@ -14927,7 +14924,7 @@
         <w:ind w:left="1440" w:hanging="360"/>
       </w:pPr>
     </w:lvl>
-    <w:lvl w:ilvl="2" w:tplc="859047B0">
+    <w:lvl w:ilvl="2" w:tplc="76A28CF8">
       <w:start w:val="1"/>
       <w:numFmt w:val="bullet"/>
       <w:lvlText w:val="■"/>
@@ -14936,7 +14933,7 @@
         <w:ind w:left="2160" w:hanging="360"/>
       </w:pPr>
     </w:lvl>
-    <w:lvl w:ilvl="3" w:tplc="BBF2D0C2">
+    <w:lvl w:ilvl="3" w:tplc="6C80D69E">
       <w:start w:val="1"/>
       <w:numFmt w:val="bullet"/>
       <w:lvlText w:val="●"/>
@@ -14945,7 +14942,7 @@
         <w:ind w:left="2880" w:hanging="360"/>
       </w:pPr>
     </w:lvl>
-    <w:lvl w:ilvl="4" w:tplc="365E24A4">
+    <w:lvl w:ilvl="4" w:tplc="FD100CD0">
       <w:start w:val="1"/>
       <w:numFmt w:val="bullet"/>
       <w:lvlText w:val="○"/>
@@ -14954,7 +14951,7 @@
         <w:ind w:left="3600" w:hanging="360"/>
       </w:pPr>
     </w:lvl>
-    <w:lvl w:ilvl="5" w:tplc="321A9BD4">
+    <w:lvl w:ilvl="5" w:tplc="D20A49DC">
       <w:start w:val="1"/>
       <w:numFmt w:val="bullet"/>
       <w:lvlText w:val="■"/>
@@ -14963,7 +14960,7 @@
         <w:ind w:left="4320" w:hanging="360"/>
       </w:pPr>
     </w:lvl>
-    <w:lvl w:ilvl="6" w:tplc="7F2ADFFA">
+    <w:lvl w:ilvl="6" w:tplc="DD2EB40C">
       <w:start w:val="1"/>
       <w:numFmt w:val="bullet"/>
       <w:lvlText w:val="●"/>
@@ -14972,7 +14969,7 @@
         <w:ind w:left="5040" w:hanging="360"/>
       </w:pPr>
     </w:lvl>
-    <w:lvl w:ilvl="7" w:tplc="2D9E735A">
+    <w:lvl w:ilvl="7" w:tplc="B9DCBA76">
       <w:start w:val="1"/>
       <w:numFmt w:val="bullet"/>
       <w:lvlText w:val="●"/>
@@ -14981,7 +14978,7 @@
         <w:ind w:left="5760" w:hanging="360"/>
       </w:pPr>
     </w:lvl>
-    <w:lvl w:ilvl="8" w:tplc="9D88F492">
+    <w:lvl w:ilvl="8" w:tplc="CEDEBDC0">
       <w:start w:val="1"/>
       <w:numFmt w:val="bullet"/>
       <w:lvlText w:val="●"/>
@@ -14992,85 +14989,88 @@
     </w:lvl>
   </w:abstractNum>
   <w:abstractNum w:abstractNumId="4" w15:restartNumberingAfterBreak="0">
-    <w:nsid w:val="679936A6"/>
+    <w:nsid w:val="46B54212"/>
     <w:multiLevelType w:val="hybridMultilevel"/>
-    <w:tmpl w:val="9106249E"/>
-    <w:lvl w:ilvl="0" w:tplc="11CAF7E4">
+    <w:tmpl w:val="DB06F1C6"/>
+    <w:lvl w:ilvl="0" w:tplc="DD7678A0">
       <w:start w:val="1"/>
-      <w:numFmt w:val="bullet"/>
-      <w:lvlText w:val="•"/>
+      <w:numFmt w:val="decimal"/>
+      <w:lvlText w:val="%1."/>
       <w:lvlJc w:val="left"/>
       <w:pPr>
         <w:ind w:left="540" w:hanging="360"/>
       </w:pPr>
+      <w:rPr>
+        <w:rFonts w:ascii="Times New Roman" w:eastAsia="Times New Roman" w:hAnsi="Times New Roman" w:cs="Times New Roman"/>
+      </w:rPr>
     </w:lvl>
-    <w:lvl w:ilvl="1" w:tplc="96D86F1E">
+    <w:lvl w:ilvl="1" w:tplc="142A023E">
       <w:numFmt w:val="decimal"/>
       <w:lvlText w:val=""/>
       <w:lvlJc w:val="left"/>
     </w:lvl>
-    <w:lvl w:ilvl="2" w:tplc="50A419FC">
+    <w:lvl w:ilvl="2" w:tplc="6642542C">
       <w:numFmt w:val="decimal"/>
       <w:lvlText w:val=""/>
       <w:lvlJc w:val="left"/>
     </w:lvl>
-    <w:lvl w:ilvl="3" w:tplc="33FE0EFE">
+    <w:lvl w:ilvl="3" w:tplc="86CA8F7C">
       <w:numFmt w:val="decimal"/>
       <w:lvlText w:val=""/>
       <w:lvlJc w:val="left"/>
     </w:lvl>
-    <w:lvl w:ilvl="4" w:tplc="6FDE1D82">
+    <w:lvl w:ilvl="4" w:tplc="E9980086">
       <w:numFmt w:val="decimal"/>
       <w:lvlText w:val=""/>
       <w:lvlJc w:val="left"/>
     </w:lvl>
-    <w:lvl w:ilvl="5" w:tplc="673AABAA">
+    <w:lvl w:ilvl="5" w:tplc="8CA87EC8">
       <w:numFmt w:val="decimal"/>
       <w:lvlText w:val=""/>
       <w:lvlJc w:val="left"/>
     </w:lvl>
-    <w:lvl w:ilvl="6" w:tplc="295AAEDE">
+    <w:lvl w:ilvl="6" w:tplc="3516E2C8">
       <w:numFmt w:val="decimal"/>
       <w:lvlText w:val=""/>
       <w:lvlJc w:val="left"/>
     </w:lvl>
-    <w:lvl w:ilvl="7" w:tplc="24FA04BE">
+    <w:lvl w:ilvl="7" w:tplc="99A8340C">
       <w:numFmt w:val="decimal"/>
       <w:lvlText w:val=""/>
       <w:lvlJc w:val="left"/>
     </w:lvl>
-    <w:lvl w:ilvl="8" w:tplc="62C82DAC">
+    <w:lvl w:ilvl="8" w:tplc="001218DE">
       <w:numFmt w:val="decimal"/>
       <w:lvlText w:val=""/>
       <w:lvlJc w:val="left"/>
     </w:lvl>
   </w:abstractNum>
-  <w:num w:numId="1" w16cid:durableId="801003686">
+  <w:num w:numId="1" w16cid:durableId="245114110">
     <w:abstractNumId w:val="3"/>
     <w:lvlOverride w:ilvl="0">
       <w:startOverride w:val="1"/>
     </w:lvlOverride>
   </w:num>
-  <w:num w:numId="2" w16cid:durableId="600532323">
+  <w:num w:numId="2" w16cid:durableId="1018966170">
     <w:abstractNumId w:val="2"/>
     <w:lvlOverride w:ilvl="0">
       <w:startOverride w:val="1"/>
     </w:lvlOverride>
   </w:num>
-  <w:num w:numId="3" w16cid:durableId="501968967">
-    <w:abstractNumId w:val="1"/>
+  <w:num w:numId="3" w16cid:durableId="116799844">
+    <w:abstractNumId w:val="4"/>
     <w:lvlOverride w:ilvl="0">
       <w:startOverride w:val="1"/>
     </w:lvlOverride>
   </w:num>
-  <w:num w:numId="4" w16cid:durableId="2075352086">
+  <w:num w:numId="4" w16cid:durableId="1301115200">
     <w:abstractNumId w:val="0"/>
     <w:lvlOverride w:ilvl="0">
       <w:startOverride w:val="1"/>
     </w:lvlOverride>
   </w:num>
-  <w:num w:numId="5" w16cid:durableId="1471820128">
-    <w:abstractNumId w:val="4"/>
+  <w:num w:numId="5" w16cid:durableId="11032376">
+    <w:abstractNumId w:val="1"/>
     <w:lvlOverride w:ilvl="0">
       <w:startOverride w:val="1"/>
     </w:lvlOverride>
@@ -15655,7 +15655,7 @@
     <w:autoRedefine/>
     <w:uiPriority w:val="39"/>
     <w:unhideWhenUsed/>
-    <w:rsid w:val="00A61EBE"/>
+    <w:rsid w:val="00D81311"/>
     <w:pPr>
       <w:spacing w:after="100"/>
     </w:pPr>
@@ -15667,7 +15667,7 @@
     <w:autoRedefine/>
     <w:uiPriority w:val="39"/>
     <w:unhideWhenUsed/>
-    <w:rsid w:val="00A61EBE"/>
+    <w:rsid w:val="00D81311"/>
     <w:pPr>
       <w:spacing w:after="100"/>
       <w:ind w:left="240"/>

</xml_diff>